<commit_message>
Document in-place ChatGPT tool refresh
</commit_message>
<xml_diff>
--- a/docs/QQ-MCP-for-SnowLuma-安装与使用教程.docx
+++ b/docs/QQ-MCP-for-SnowLuma-安装与使用教程.docx
@@ -4186,7 +4186,7 @@
         <w:rPr>
           <w:rFonts w:ascii="Microsoft YaHei" w:hAnsi="Microsoft YaHei" w:eastAsia="Microsoft YaHei"/>
         </w:rPr>
-        <w:t>新建对话，选择或 @QQ，先调用 qq_status 做只读验证。</w:t>
+        <w:t>回到原来的对话，重新选择或 @QQ，先调用 qq_status 做只读验证；若仍使用旧工具 schema，再新开对话排障。</w:t>
       </w:r>
     </w:p>
     <w:p>
@@ -4213,7 +4213,7 @@
         <w:rPr>
           <w:rFonts w:ascii="Microsoft YaHei" w:hAnsi="Microsoft YaHei" w:eastAsia="Microsoft YaHei"/>
         </w:rPr>
-        <w:t>ChatGPT 可能保存工具 schema 快照。MCP 更新后，在应用管理页执行 Refresh 或 Scan Tools，再新开对话。工具数量仍是 18 个并不代表没有更新，可检查 qq_wait_for_message 是否出现 flow_target_duration_ms 等新参数。</w:t>
+        <w:t>ChatGPT 可能保存工具 schema 快照。MCP 更新后，在应用管理页执行 Refresh 或 Scan Tools，回到原来的对话并重新 @QQ；实测无需专门新建对话。工具数量仍是 18 个并不代表没有更新，可检查 qq_wait_for_message 是否出现 flow_target_duration_ms 等新参数。如果原对话仍显示旧参数、找不到工具或调用继续报旧版参数错误，再新开对话作为备用排障步骤。</w:t>
       </w:r>
     </w:p>
     <w:p>
@@ -7880,7 +7880,7 @@
                 <w:color w:val="000000"/>
                 <w:sz w:val="16"/>
               </w:rPr>
-              <w:t>重启本地 MCP，确认 Tunnel ready，在应用管理页 Refresh 或 Scan Tools，再新开对话。</w:t>
+              <w:t>重启本地 MCP，确认 Tunnel ready，在应用管理页 Refresh 或 Scan Tools，回到原对话重新 @QQ；仍显示旧参数时再新开对话排障。</w:t>
             </w:r>
           </w:p>
         </w:tc>

</xml_diff>